<commit_message>
feat: ship v0.3.0 workflow product upgrades
</commit_message>
<xml_diff>
--- a/docs/AI-Workflow-CLI-Usage-EN.docx
+++ b/docs/AI-Workflow-CLI-Usage-EN.docx
@@ -29,7 +29,7 @@
     </w:p>
     <w:p>
       <w:r>
-        <w:t>AI Workflow CLI (`awf`) adds a private local AI workflow layer to any Git repository while keeping public release artifacts clean.</w:t>
+        <w:t>AI Workflow CLI (`awf`) adds a private local AI workflow layer to any Git repository while keeping formal release artifacts clean.</w:t>
       </w:r>
     </w:p>
     <w:p/>
@@ -76,7 +76,7 @@
         <w:pStyle w:val="Heading2"/>
       </w:pPr>
       <w:r>
-        <w:t>2. Core features</w:t>
+        <w:t>2. Core upgrades in 0.3.0</w:t>
       </w:r>
     </w:p>
     <w:p>
@@ -84,7 +84,7 @@
         <w:pStyle w:val="ListBullet"/>
       </w:pPr>
       <w:r>
-        <w:t>Creates a dedicated `.ai-workflow/` directory</w:t>
+        <w:t>adds `awf release` for clean formal release bundles with release notes</w:t>
       </w:r>
     </w:p>
     <w:p>
@@ -92,7 +92,7 @@
         <w:pStyle w:val="ListBullet"/>
       </w:pPr>
       <w:r>
-        <w:t>Generates project context, tasks, decisions, session log, rules, and next action files</w:t>
+        <w:t>stronger detection for monorepos / pnpm workspaces / Turborepo / Next.js / Go / Rust</w:t>
       </w:r>
     </w:p>
     <w:p>
@@ -100,7 +100,7 @@
         <w:pStyle w:val="ListBullet"/>
       </w:pPr>
       <w:r>
-        <w:t>Uses `.git/info/exclude` by default to avoid polluting upstream repositories</w:t>
+        <w:t>stronger `awf doctor` checks for workflow files, git exclude, hooks, VS Code, pre-commit, and package artifacts</w:t>
       </w:r>
     </w:p>
     <w:p>
@@ -108,7 +108,7 @@
         <w:pStyle w:val="ListBullet"/>
       </w:pPr>
       <w:r>
-        <w:t>Exports a clean formal release without the AI workflow layer</w:t>
+        <w:t>adds `awf completion` for bash / zsh / fish</w:t>
       </w:r>
     </w:p>
     <w:p>
@@ -116,7 +116,7 @@
         <w:pStyle w:val="ListBullet"/>
       </w:pPr>
       <w:r>
-        <w:t>Supports git hooks for post-checkout / post-merge workflow refreshes</w:t>
+        <w:t>adds `awf hooks --with-pre-commit` for team-friendly repository setup</w:t>
       </w:r>
     </w:p>
     <w:p/>
@@ -129,8 +129,16 @@
       </w:r>
     </w:p>
     <w:p>
+      <w:pPr>
+        <w:pStyle w:val="Heading3"/>
+      </w:pPr>
       <w:r>
-        <w:t>```</w:t>
+        <w:t>Development install</w:t>
+      </w:r>
+    </w:p>
+    <w:p>
+      <w:r>
+        <w:t>```bash</w:t>
       </w:r>
     </w:p>
     <w:p>
@@ -155,8 +163,21 @@
     </w:p>
     <w:p/>
     <w:p>
+      <w:pPr>
+        <w:pStyle w:val="Heading3"/>
+      </w:pPr>
       <w:r>
-        <w:t>Then run:</w:t>
+        <w:t>Recommended public install path later</w:t>
+      </w:r>
+    </w:p>
+    <w:p>
+      <w:r>
+        <w:t>```bash</w:t>
+      </w:r>
+    </w:p>
+    <w:p>
+      <w:r>
+        <w:t>pipx install ai-workflow-cli</w:t>
       </w:r>
     </w:p>
     <w:p>
@@ -164,9 +185,23 @@
         <w:t>```</w:t>
       </w:r>
     </w:p>
+    <w:p/>
+    <w:p>
+      <w:pPr>
+        <w:pStyle w:val="Heading3"/>
+      </w:pPr>
+      <w:r>
+        <w:t>Install from release artifact</w:t>
+      </w:r>
+    </w:p>
     <w:p>
       <w:r>
-        <w:t>awf --help</w:t>
+        <w:t>```bash</w:t>
+      </w:r>
+    </w:p>
+    <w:p>
+      <w:r>
+        <w:t>pip install ai_workflow_cli-0.3.0-py3-none-any.whl</w:t>
       </w:r>
     </w:p>
     <w:p>
@@ -193,12 +228,17 @@
     </w:p>
     <w:p>
       <w:r>
-        <w:t>```</w:t>
+        <w:t>```bash</w:t>
       </w:r>
     </w:p>
     <w:p>
       <w:r>
         <w:t>awf init</w:t>
+      </w:r>
+    </w:p>
+    <w:p>
+      <w:r>
+        <w:t>awf init --with-vscode</w:t>
       </w:r>
     </w:p>
     <w:p>
@@ -217,12 +257,17 @@
     </w:p>
     <w:p>
       <w:r>
-        <w:t>```</w:t>
+        <w:t>```bash</w:t>
       </w:r>
     </w:p>
     <w:p>
       <w:r>
         <w:t>awf adopt</w:t>
+      </w:r>
+    </w:p>
+    <w:p>
+      <w:r>
+        <w:t>awf adopt --with-vscode</w:t>
       </w:r>
     </w:p>
     <w:p>
@@ -241,7 +286,7 @@
     </w:p>
     <w:p>
       <w:r>
-        <w:t>```</w:t>
+        <w:t>```bash</w:t>
       </w:r>
     </w:p>
     <w:p>
@@ -265,36 +310,12 @@
         <w:pStyle w:val="Heading3"/>
       </w:pPr>
       <w:r>
-        <w:t>Show current workflow status</w:t>
-      </w:r>
-    </w:p>
-    <w:p>
-      <w:r>
-        <w:t>```</w:t>
-      </w:r>
-    </w:p>
-    <w:p>
-      <w:r>
-        <w:t>awf status</w:t>
-      </w:r>
-    </w:p>
-    <w:p>
-      <w:r>
-        <w:t>```</w:t>
-      </w:r>
-    </w:p>
-    <w:p/>
-    <w:p>
-      <w:pPr>
-        <w:pStyle w:val="Heading3"/>
-      </w:pPr>
-      <w:r>
         <w:t>Validate workflow health</w:t>
       </w:r>
     </w:p>
     <w:p>
       <w:r>
-        <w:t>```</w:t>
+        <w:t>```bash</w:t>
       </w:r>
     </w:p>
     <w:p>
@@ -318,7 +339,7 @@
     </w:p>
     <w:p>
       <w:r>
-        <w:t>```</w:t>
+        <w:t>```bash</w:t>
       </w:r>
     </w:p>
     <w:p>
@@ -337,7 +358,17 @@
         <w:pStyle w:val="Heading3"/>
       </w:pPr>
       <w:r>
-        <w:t>Install auto-sync hooks</w:t>
+        <w:t>Create a release bundle</w:t>
+      </w:r>
+    </w:p>
+    <w:p>
+      <w:r>
+        <w:t>```bash</w:t>
+      </w:r>
+    </w:p>
+    <w:p>
+      <w:r>
+        <w:t>awf release --version 0.3.0</w:t>
       </w:r>
     </w:p>
     <w:p>
@@ -345,9 +376,47 @@
         <w:t>```</w:t>
       </w:r>
     </w:p>
+    <w:p/>
+    <w:p>
+      <w:pPr>
+        <w:pStyle w:val="Heading3"/>
+      </w:pPr>
+      <w:r>
+        <w:t>Install hooks and pre-commit support</w:t>
+      </w:r>
+    </w:p>
     <w:p>
       <w:r>
-        <w:t>awf hooks</w:t>
+        <w:t>```bash</w:t>
+      </w:r>
+    </w:p>
+    <w:p>
+      <w:r>
+        <w:t>awf hooks --with-pre-commit</w:t>
+      </w:r>
+    </w:p>
+    <w:p>
+      <w:r>
+        <w:t>```</w:t>
+      </w:r>
+    </w:p>
+    <w:p/>
+    <w:p>
+      <w:pPr>
+        <w:pStyle w:val="Heading3"/>
+      </w:pPr>
+      <w:r>
+        <w:t>Print shell completion setup</w:t>
+      </w:r>
+    </w:p>
+    <w:p>
+      <w:r>
+        <w:t>```bash</w:t>
+      </w:r>
+    </w:p>
+    <w:p>
+      <w:r>
+        <w:t>awf completion zsh</w:t>
       </w:r>
     </w:p>
     <w:p>
@@ -366,7 +435,7 @@
     </w:p>
     <w:p>
       <w:r>
-        <w:t>```</w:t>
+        <w:t>```text</w:t>
       </w:r>
     </w:p>
     <w:p>
@@ -455,32 +524,63 @@
         <w:pStyle w:val="Heading2"/>
       </w:pPr>
       <w:r>
-        <w:t>6. Recommended daily workflow</w:t>
+        <w:t>6. VS Code auto integration</w:t>
       </w:r>
     </w:p>
     <w:p>
       <w:r>
-        <w:t>1. Run `awf adopt` or `awf init`</w:t>
+        <w:t>Run:</w:t>
       </w:r>
     </w:p>
     <w:p>
       <w:r>
-        <w:t>2. Make your coding agent read the shared workflow docs under `.ai-workflow/`</w:t>
+        <w:t>```bash</w:t>
       </w:r>
     </w:p>
     <w:p>
       <w:r>
-        <w:t>3. Start from `NEXT_ACTION.md`</w:t>
+        <w:t>awf adopt --with-vscode</w:t>
       </w:r>
     </w:p>
     <w:p>
       <w:r>
-        <w:t>4. After meaningful work, run `awf sync --note "what changed"`</w:t>
+        <w:t>```</w:t>
+      </w:r>
+    </w:p>
+    <w:p/>
+    <w:p>
+      <w:r>
+        <w:t>This generates:</w:t>
       </w:r>
     </w:p>
     <w:p>
+      <w:pPr>
+        <w:pStyle w:val="ListBullet"/>
+      </w:pPr>
       <w:r>
-        <w:t>5. Before publishing, run `awf export`</w:t>
+        <w:t>`.vscode/tasks.json`</w:t>
+      </w:r>
+    </w:p>
+    <w:p>
+      <w:pPr>
+        <w:pStyle w:val="ListBullet"/>
+      </w:pPr>
+      <w:r>
+        <w:t>`.vscode/settings.json`</w:t>
+      </w:r>
+    </w:p>
+    <w:p>
+      <w:pPr>
+        <w:pStyle w:val="ListBullet"/>
+      </w:pPr>
+      <w:r>
+        <w:t>`.vscode/extensions.json`</w:t>
+      </w:r>
+    </w:p>
+    <w:p/>
+    <w:p>
+      <w:r>
+        <w:t>and allows VS Code to auto-run `awf sync` on folder open.</w:t>
       </w:r>
     </w:p>
     <w:p/>
@@ -507,7 +607,7 @@
         <w:pStyle w:val="ListBullet"/>
       </w:pPr>
       <w:r>
-        <w:t>local development can keep a rich AI workflow layer</w:t>
+        <w:t>local development keeps a rich AI workflow layer</w:t>
       </w:r>
     </w:p>
     <w:p>
@@ -523,7 +623,7 @@
         <w:pStyle w:val="ListBullet"/>
       </w:pPr>
       <w:r>
-        <w:t>`awf export` produces a formal release tree without `.ai-workflow/`</w:t>
+        <w:t>`awf export` and `awf release` outputs do not include `.ai-workflow/`</w:t>
       </w:r>
     </w:p>
     <w:p/>
@@ -553,7 +653,7 @@
         <w:pStyle w:val="ListBullet"/>
       </w:pPr>
       <w:r>
-        <w:t>Node / React / Vite style adoption</w:t>
+        <w:t>Node / React / Vite / Next.js / pnpm workspace / Turborepo detection</w:t>
       </w:r>
     </w:p>
     <w:p>
@@ -561,7 +661,7 @@
         <w:pStyle w:val="ListBullet"/>
       </w:pPr>
       <w:r>
-        <w:t>Python / FastAPI style adoption</w:t>
+        <w:t>Python / FastAPI detection</w:t>
       </w:r>
     </w:p>
     <w:p>
@@ -569,7 +669,15 @@
         <w:pStyle w:val="ListBullet"/>
       </w:pPr>
       <w:r>
-        <w:t>working `sync`, `doctor`, `export`, and `hooks` commands</w:t>
+        <w:t>Go detection</w:t>
+      </w:r>
+    </w:p>
+    <w:p>
+      <w:pPr>
+        <w:pStyle w:val="ListBullet"/>
+      </w:pPr>
+      <w:r>
+        <w:t>`sync`, `doctor`, `export`, `release`, `hooks`, and `completion`</w:t>
       </w:r>
     </w:p>
     <w:p>
@@ -585,7 +693,15 @@
         <w:pStyle w:val="ListBullet"/>
       </w:pPr>
       <w:r>
-        <w:t>GitHub Actions CI on Python 3.11 and 3.12</w:t>
+        <w:t>wheel installation validation</w:t>
+      </w:r>
+    </w:p>
+    <w:p>
+      <w:pPr>
+        <w:pStyle w:val="ListBullet"/>
+      </w:pPr>
+      <w:r>
+        <w:t>GitHub Actions on Python 3.11 and 3.12</w:t>
       </w:r>
     </w:p>
     <w:p/>
@@ -661,7 +777,15 @@
         <w:pStyle w:val="ListBullet"/>
       </w:pPr>
       <w:r>
-        <w:t>VS Code extension</w:t>
+        <w:t>publish to PyPI</w:t>
+      </w:r>
+    </w:p>
+    <w:p>
+      <w:pPr>
+        <w:pStyle w:val="ListBullet"/>
+      </w:pPr>
+      <w:r>
+        <w:t>public `pipx` install flow</w:t>
       </w:r>
     </w:p>
     <w:p>
@@ -677,7 +801,7 @@
         <w:pStyle w:val="ListBullet"/>
       </w:pPr>
       <w:r>
-        <w:t>`awf release` publishing command</w:t>
+        <w:t>deeper monorepo awareness</w:t>
       </w:r>
     </w:p>
     <w:p>
@@ -685,7 +809,7 @@
         <w:pStyle w:val="ListBullet"/>
       </w:pPr>
       <w:r>
-        <w:t>deeper project structure detection</w:t>
+        <w:t>more editor entrypoints beyond VS Code</w:t>
       </w:r>
     </w:p>
     <w:sectPr>

</xml_diff>

<commit_message>
feat: ship v0.4.0 language and watcher upgrades
</commit_message>
<xml_diff>
--- a/docs/AI-Workflow-CLI-Usage-EN.docx
+++ b/docs/AI-Workflow-CLI-Usage-EN.docx
@@ -76,7 +76,7 @@
         <w:pStyle w:val="Heading2"/>
       </w:pPr>
       <w:r>
-        <w:t>2. Core upgrades in 0.3.0</w:t>
+        <w:t>2. Core upgrades in 0.4.0</w:t>
       </w:r>
     </w:p>
     <w:p>
@@ -84,7 +84,7 @@
         <w:pStyle w:val="ListBullet"/>
       </w:pPr>
       <w:r>
-        <w:t>adds `awf release` for clean formal release bundles with release notes</w:t>
+        <w:t>adds `awf watch` for polling-based local auto-sync</w:t>
       </w:r>
     </w:p>
     <w:p>
@@ -92,7 +92,7 @@
         <w:pStyle w:val="ListBullet"/>
       </w:pPr>
       <w:r>
-        <w:t>stronger detection for monorepos / pnpm workspaces / Turborepo / Next.js / Go / Rust</w:t>
+        <w:t>adds C and C++ detection, including CMake-style projects</w:t>
       </w:r>
     </w:p>
     <w:p>
@@ -100,7 +100,7 @@
         <w:pStyle w:val="ListBullet"/>
       </w:pPr>
       <w:r>
-        <w:t>stronger `awf doctor` checks for workflow files, git exclude, hooks, VS Code, pre-commit, and package artifacts</w:t>
+        <w:t>strengthens Rust / Python / Node / monorepo / pnpm workspace / Turborepo detection</w:t>
       </w:r>
     </w:p>
     <w:p>
@@ -108,7 +108,7 @@
         <w:pStyle w:val="ListBullet"/>
       </w:pPr>
       <w:r>
-        <w:t>adds `awf completion` for bash / zsh / fish</w:t>
+        <w:t>adds `MANIFEST.json` to `awf release` bundles</w:t>
       </w:r>
     </w:p>
     <w:p>
@@ -116,7 +116,7 @@
         <w:pStyle w:val="ListBullet"/>
       </w:pPr>
       <w:r>
-        <w:t>adds `awf hooks --with-pre-commit` for team-friendly repository setup</w:t>
+        <w:t>improves product-facing presentation for public launch readiness</w:t>
       </w:r>
     </w:p>
     <w:p/>
@@ -125,7 +125,218 @@
         <w:pStyle w:val="Heading2"/>
       </w:pPr>
       <w:r>
-        <w:t>3. Installation</w:t>
+        <w:t>3. Supported languages / project types</w:t>
+      </w:r>
+    </w:p>
+    <w:p>
+      <w:pPr>
+        <w:pStyle w:val="Heading3"/>
+      </w:pPr>
+      <w:r>
+        <w:t>Web / app / service</w:t>
+      </w:r>
+    </w:p>
+    <w:p>
+      <w:pPr>
+        <w:pStyle w:val="ListBullet"/>
+      </w:pPr>
+      <w:r>
+        <w:t>npm / pnpm / yarn / bun</w:t>
+      </w:r>
+    </w:p>
+    <w:p>
+      <w:pPr>
+        <w:pStyle w:val="ListBullet"/>
+      </w:pPr>
+      <w:r>
+        <w:t>React</w:t>
+      </w:r>
+    </w:p>
+    <w:p>
+      <w:pPr>
+        <w:pStyle w:val="ListBullet"/>
+      </w:pPr>
+      <w:r>
+        <w:t>Next.js</w:t>
+      </w:r>
+    </w:p>
+    <w:p>
+      <w:pPr>
+        <w:pStyle w:val="ListBullet"/>
+      </w:pPr>
+      <w:r>
+        <w:t>Vite</w:t>
+      </w:r>
+    </w:p>
+    <w:p>
+      <w:pPr>
+        <w:pStyle w:val="ListBullet"/>
+      </w:pPr>
+      <w:r>
+        <w:t>Vue</w:t>
+      </w:r>
+    </w:p>
+    <w:p>
+      <w:pPr>
+        <w:pStyle w:val="ListBullet"/>
+      </w:pPr>
+      <w:r>
+        <w:t>Nuxt</w:t>
+      </w:r>
+    </w:p>
+    <w:p>
+      <w:pPr>
+        <w:pStyle w:val="ListBullet"/>
+      </w:pPr>
+      <w:r>
+        <w:t>Svelte / SvelteKit</w:t>
+      </w:r>
+    </w:p>
+    <w:p>
+      <w:pPr>
+        <w:pStyle w:val="ListBullet"/>
+      </w:pPr>
+      <w:r>
+        <w:t>Express</w:t>
+      </w:r>
+    </w:p>
+    <w:p>
+      <w:pPr>
+        <w:pStyle w:val="ListBullet"/>
+      </w:pPr>
+      <w:r>
+        <w:t>NestJS</w:t>
+      </w:r>
+    </w:p>
+    <w:p>
+      <w:pPr>
+        <w:pStyle w:val="ListBullet"/>
+      </w:pPr>
+      <w:r>
+        <w:t>monorepo / pnpm workspace / Turborepo / Nx signals</w:t>
+      </w:r>
+    </w:p>
+    <w:p/>
+    <w:p>
+      <w:pPr>
+        <w:pStyle w:val="Heading3"/>
+      </w:pPr>
+      <w:r>
+        <w:t>Python</w:t>
+      </w:r>
+    </w:p>
+    <w:p>
+      <w:pPr>
+        <w:pStyle w:val="ListBullet"/>
+      </w:pPr>
+      <w:r>
+        <w:t>pip</w:t>
+      </w:r>
+    </w:p>
+    <w:p>
+      <w:pPr>
+        <w:pStyle w:val="ListBullet"/>
+      </w:pPr>
+      <w:r>
+        <w:t>poetry</w:t>
+      </w:r>
+    </w:p>
+    <w:p>
+      <w:pPr>
+        <w:pStyle w:val="ListBullet"/>
+      </w:pPr>
+      <w:r>
+        <w:t>uv</w:t>
+      </w:r>
+    </w:p>
+    <w:p>
+      <w:pPr>
+        <w:pStyle w:val="ListBullet"/>
+      </w:pPr>
+      <w:r>
+        <w:t>FastAPI</w:t>
+      </w:r>
+    </w:p>
+    <w:p>
+      <w:pPr>
+        <w:pStyle w:val="ListBullet"/>
+      </w:pPr>
+      <w:r>
+        <w:t>Django</w:t>
+      </w:r>
+    </w:p>
+    <w:p>
+      <w:pPr>
+        <w:pStyle w:val="ListBullet"/>
+      </w:pPr>
+      <w:r>
+        <w:t>Flask</w:t>
+      </w:r>
+    </w:p>
+    <w:p>
+      <w:pPr>
+        <w:pStyle w:val="ListBullet"/>
+      </w:pPr>
+      <w:r>
+        <w:t>Streamlit</w:t>
+      </w:r>
+    </w:p>
+    <w:p/>
+    <w:p>
+      <w:pPr>
+        <w:pStyle w:val="Heading3"/>
+      </w:pPr>
+      <w:r>
+        <w:t>Systems / compiled languages</w:t>
+      </w:r>
+    </w:p>
+    <w:p>
+      <w:pPr>
+        <w:pStyle w:val="ListBullet"/>
+      </w:pPr>
+      <w:r>
+        <w:t>Go</w:t>
+      </w:r>
+    </w:p>
+    <w:p>
+      <w:pPr>
+        <w:pStyle w:val="ListBullet"/>
+      </w:pPr>
+      <w:r>
+        <w:t>Rust</w:t>
+      </w:r>
+    </w:p>
+    <w:p>
+      <w:pPr>
+        <w:pStyle w:val="ListBullet"/>
+      </w:pPr>
+      <w:r>
+        <w:t>C</w:t>
+      </w:r>
+    </w:p>
+    <w:p>
+      <w:pPr>
+        <w:pStyle w:val="ListBullet"/>
+      </w:pPr>
+      <w:r>
+        <w:t>C++</w:t>
+      </w:r>
+    </w:p>
+    <w:p>
+      <w:pPr>
+        <w:pStyle w:val="ListBullet"/>
+      </w:pPr>
+      <w:r>
+        <w:t>CMake-style C/C++ projects</w:t>
+      </w:r>
+    </w:p>
+    <w:p/>
+    <w:p>
+      <w:pPr>
+        <w:pStyle w:val="Heading2"/>
+      </w:pPr>
+      <w:r>
+        <w:t>4. Installation</w:t>
       </w:r>
     </w:p>
     <w:p>
@@ -167,6 +378,30 @@
         <w:pStyle w:val="Heading3"/>
       </w:pPr>
       <w:r>
+        <w:t>Install from release artifact</w:t>
+      </w:r>
+    </w:p>
+    <w:p>
+      <w:r>
+        <w:t>```bash</w:t>
+      </w:r>
+    </w:p>
+    <w:p>
+      <w:r>
+        <w:t>pip install ai_workflow_cli-0.4.0-py3-none-any.whl</w:t>
+      </w:r>
+    </w:p>
+    <w:p>
+      <w:r>
+        <w:t>```</w:t>
+      </w:r>
+    </w:p>
+    <w:p/>
+    <w:p>
+      <w:pPr>
+        <w:pStyle w:val="Heading3"/>
+      </w:pPr>
+      <w:r>
         <w:t>Recommended public install path later</w:t>
       </w:r>
     </w:p>
@@ -188,34 +423,10 @@
     <w:p/>
     <w:p>
       <w:pPr>
-        <w:pStyle w:val="Heading3"/>
-      </w:pPr>
-      <w:r>
-        <w:t>Install from release artifact</w:t>
-      </w:r>
-    </w:p>
-    <w:p>
-      <w:r>
-        <w:t>```bash</w:t>
-      </w:r>
-    </w:p>
-    <w:p>
-      <w:r>
-        <w:t>pip install ai_workflow_cli-0.3.0-py3-none-any.whl</w:t>
-      </w:r>
-    </w:p>
-    <w:p>
-      <w:r>
-        <w:t>```</w:t>
-      </w:r>
-    </w:p>
-    <w:p/>
-    <w:p>
-      <w:pPr>
         <w:pStyle w:val="Heading2"/>
       </w:pPr>
       <w:r>
-        <w:t>4. Main commands</w:t>
+        <w:t>5. Main commands</w:t>
       </w:r>
     </w:p>
     <w:p>
@@ -310,6 +521,30 @@
         <w:pStyle w:val="Heading3"/>
       </w:pPr>
       <w:r>
+        <w:t>Watch local file changes</w:t>
+      </w:r>
+    </w:p>
+    <w:p>
+      <w:r>
+        <w:t>```bash</w:t>
+      </w:r>
+    </w:p>
+    <w:p>
+      <w:r>
+        <w:t>awf watch --duration 60 --interval 1</w:t>
+      </w:r>
+    </w:p>
+    <w:p>
+      <w:r>
+        <w:t>```</w:t>
+      </w:r>
+    </w:p>
+    <w:p/>
+    <w:p>
+      <w:pPr>
+        <w:pStyle w:val="Heading3"/>
+      </w:pPr>
+      <w:r>
         <w:t>Validate workflow health</w:t>
       </w:r>
     </w:p>
@@ -368,7 +603,7 @@
     </w:p>
     <w:p>
       <w:r>
-        <w:t>awf release --version 0.3.0</w:t>
+        <w:t>awf release --version 0.4.0</w:t>
       </w:r>
     </w:p>
     <w:p>
@@ -430,7 +665,7 @@
         <w:pStyle w:val="Heading2"/>
       </w:pPr>
       <w:r>
-        <w:t>5. Generated structure</w:t>
+        <w:t>6. Generated structure</w:t>
       </w:r>
     </w:p>
     <w:p>
@@ -524,7 +759,7 @@
         <w:pStyle w:val="Heading2"/>
       </w:pPr>
       <w:r>
-        <w:t>6. VS Code auto integration</w:t>
+        <w:t>7. VS Code auto integration</w:t>
       </w:r>
     </w:p>
     <w:p>
@@ -589,7 +824,7 @@
         <w:pStyle w:val="Heading2"/>
       </w:pPr>
       <w:r>
-        <w:t>7. Clean release separation</w:t>
+        <w:t>8. Clean release separation</w:t>
       </w:r>
     </w:p>
     <w:p>
@@ -632,7 +867,7 @@
         <w:pStyle w:val="Heading2"/>
       </w:pPr>
       <w:r>
-        <w:t>8. Validation status</w:t>
+        <w:t>9. Validation status</w:t>
       </w:r>
     </w:p>
     <w:p>
@@ -669,7 +904,7 @@
         <w:pStyle w:val="ListBullet"/>
       </w:pPr>
       <w:r>
-        <w:t>Go detection</w:t>
+        <w:t>Go / Rust detection</w:t>
       </w:r>
     </w:p>
     <w:p>
@@ -677,7 +912,15 @@
         <w:pStyle w:val="ListBullet"/>
       </w:pPr>
       <w:r>
-        <w:t>`sync`, `doctor`, `export`, `release`, `hooks`, and `completion`</w:t>
+        <w:t>C / C++ / CMake detection</w:t>
+      </w:r>
+    </w:p>
+    <w:p>
+      <w:pPr>
+        <w:pStyle w:val="ListBullet"/>
+      </w:pPr>
+      <w:r>
+        <w:t>`sync`, `watch`, `doctor`, `export`, `release`, `hooks`, and `completion`</w:t>
       </w:r>
     </w:p>
     <w:p>
@@ -710,7 +953,7 @@
         <w:pStyle w:val="Heading2"/>
       </w:pPr>
       <w:r>
-        <w:t>9. Model compatibility</w:t>
+        <w:t>10. Model compatibility</w:t>
       </w:r>
     </w:p>
     <w:p>
@@ -764,7 +1007,7 @@
         <w:pStyle w:val="Heading2"/>
       </w:pPr>
       <w:r>
-        <w:t>10. Suggested next steps</w:t>
+        <w:t>11. Suggested next steps</w:t>
       </w:r>
     </w:p>
     <w:p>
@@ -793,7 +1036,7 @@
         <w:pStyle w:val="ListBullet"/>
       </w:pPr>
       <w:r>
-        <w:t>file watcher based auto-sync</w:t>
+        <w:t>smarter watcher / background daemon mode</w:t>
       </w:r>
     </w:p>
     <w:p>

</xml_diff>